<commit_message>
feat: agregar documentos actualizados sobre el índice de preparación de IA y justificación en la investigación
</commit_message>
<xml_diff>
--- a/investigación/DOC-08_Justificacion_Importancia.docx
+++ b/investigación/DOC-08_Justificacion_Importancia.docx
@@ -746,7 +746,7 @@
           <w:sz w:val="24"/>
           <w:szCs w:val="24"/>
         </w:rPr>
-        <w:t xml:space="preserve">Las organizaciones que implementan agentes LLM en entornos empresariales enfrentan costos operativos directamente relacionados con el consumo de tokens. Según datos de Redis Labs (2025), el 67% del costo de inferencia en sistemas multi-herramienta corresponde a la transmisión de contexto acumulado, no a la generación de respuestas nuevas. La investigación aportará métricas cuantitativas de reducción de consumo de tokens por técnica, lo que permitirá a los equipos de arquitectura de IA realizar análisis de costo-beneficio informados antes de seleccionar su stack tecnológico de memoria. Para el contexto peruano, donde el 58.4% de las empresas que adoptan IA reportan restricciones de presupuesto como barrera principal (INEI, 2024), esta información tiene un impacto multiplicador en la viabilidad de los proyectos.</w:t>
+        <w:t xml:space="preserve">Las organizaciones que implementan agentes LLM en entornos empresariales enfrentan costos operativos directamente relacionados con el consumo de tokens. Salim et al. (2026) demostraron empíricamente que en sistemas multi-agente, los tokens de entrada —que representan contexto transmitido y acumulado— constituyen en promedio el 53.9% del consumo total, evidenciando que el costo operativo de inferencia está dominado por la acumulación de contexto, no por la generación de respuestas nuevas. La investigación aportará métricas cuantitativas de reducción de consumo de tokens por técnica, lo que permitirá a los equipos de arquitectura de IA realizar análisis de costo-beneficio informados antes de seleccionar su stack tecnológico de memoria. Para el contexto peruano, donde el 58.4% de las empresas que adoptan IA reportan restricciones de presupuesto como barrera principal (INEI, 2024), esta información tiene un impacto multiplicador en la viabilidad de los proyectos.</w:t>
       </w:r>
     </w:p>
     <w:p>
@@ -1173,7 +1173,7 @@
           <w:sz w:val="24"/>
           <w:szCs w:val="24"/>
         </w:rPr>
-        <w:t xml:space="preserve">El Perú ocupa el puesto 60 en el Government AI Readiness Index 2023 (Oxford Insights, 2023) y enfrenta una brecha significativa en talento técnico especializado en IA. Solo el 6% de las empresas peruanas que adoptan IA declaran tener equipos técnicos con capacidades avanzadas, frente al 17–18% de Chile y Colombia (INEI, 2024). La realización de investigación de posgrado en temas de frontera como la arquitectura de agentes LLM y los protocolos MCP contribuye a cerrar esta brecha formando investigadores locales capaces de producir conocimiento relevante para el contexto nacional e internacional.</w:t>
+        <w:t xml:space="preserve">El Perú ocupa el puesto 60 en el Government AI Readiness Index 2025 (Oxford Insights, 2025) y enfrenta una brecha significativa en talento técnico especializado en IA. Solo el 6% de las empresas peruanas que adoptan IA declaran tener equipos técnicos con capacidades avanzadas, frente al 17–18% de Chile y Colombia (INEI, 2024). La realización de investigación de posgrado en temas de frontera como la arquitectura de agentes LLM y los protocolos MCP contribuye a cerrar esta brecha formando investigadores locales capaces de producir conocimiento relevante para el contexto nacional e internacional.</w:t>
       </w:r>
     </w:p>
     <w:p>
@@ -2276,7 +2276,7 @@
           <w:sz w:val="24"/>
           <w:szCs w:val="24"/>
         </w:rPr>
-        <w:t xml:space="preserve">Oxford Insights. (2023). Government AI Readiness Index 2023. Oxford Insights. https://oxfordinsights.com/ai-readiness/ai-readiness-index</w:t>
+        <w:t xml:space="preserve">Oxford Insights. (2025). Government AI Readiness Index 2025. Oxford Insights. https://oxfordinsights.com/wp-content/uploads/2025/12/2025-Government-AI-Readiness-Index-2.pdf</w:t>
       </w:r>
     </w:p>
     <w:p>
@@ -2384,7 +2384,7 @@
           <w:sz w:val="24"/>
           <w:szCs w:val="24"/>
         </w:rPr>
-        <w:t xml:space="preserve">Redis Labs. (2025). Enterprise AI deployment patterns: Token consumption and memory management. Redis. https://redis.io/blog/enterprise-ai-memory-2025</w:t>
+        <w:t xml:space="preserve">Salim, M., Latendresse, J., Khatoonabadi, S., &amp; Shihab, E. (2026). Tokenomics: Quantifying where tokens are used in agentic software engineering. arXiv. https://arxiv.org/abs/2601.14470 https://redis.io/blog/enterprise-ai-memory-2025</w:t>
       </w:r>
     </w:p>
     <w:p>

</xml_diff>

<commit_message>
fix: actualizar referencias en la justificación de la investigación para incluir datos más recientes y relevantes
</commit_message>
<xml_diff>
--- a/investigación/DOC-08_Justificacion_Importancia.docx
+++ b/investigación/DOC-08_Justificacion_Importancia.docx
@@ -1173,7 +1173,7 @@
           <w:sz w:val="24"/>
           <w:szCs w:val="24"/>
         </w:rPr>
-        <w:t xml:space="preserve">El Perú ocupa el puesto 60 en el Government AI Readiness Index 2025 (Oxford Insights, 2025) y enfrenta una brecha significativa en talento técnico especializado en IA. Solo el 6% de las empresas peruanas que adoptan IA declaran tener equipos técnicos con capacidades avanzadas, frente al 17–18% de Chile y Colombia (INEI, 2024). La realización de investigación de posgrado en temas de frontera como la arquitectura de agentes LLM y los protocolos MCP contribuye a cerrar esta brecha formando investigadores locales capaces de producir conocimiento relevante para el contexto nacional e internacional.</w:t>
+        <w:t xml:space="preserve">Según el Índice Latinoamericano de Inteligencia Artificial 2025 (ILIA, 2025), Perú alcanzó una puntuación de 51.93 sobre 100, frente a 73.07 de Chile y 52.64 de Colombia, evidenciando una brecha en madurez de IA que la presente investigación busca contribuir a cerrar.</w:t>
       </w:r>
     </w:p>
     <w:p>
@@ -2168,7 +2168,7 @@
           <w:sz w:val="24"/>
           <w:szCs w:val="24"/>
         </w:rPr>
-        <w:t xml:space="preserve">INEI. (2024). Encuesta Nacional de Empresas: Uso de tecnologías de información e inteligencia artificial. Instituto Nacional de Estadística e Informática. https://www.inei.gob.pe</w:t>
+        <w:t xml:space="preserve">CEPAL / CENIA. (2025). Índice Latinoamericano de Inteligencia Artificial 2025 (ILIA). Comisión Económica para América Latina y el Caribe. https://www.cepal.org/en/pressreleases/latin-american-artificial-intelligence-index-ilia-reconfirms-chile-brazil-and-uruguay</w:t>
       </w:r>
     </w:p>
     <w:p>

</xml_diff>